<commit_message>
T208: update Sprint 1 report status and metrics
</commit_message>
<xml_diff>
--- a/docs/Weekly SPRINT 1.docx
+++ b/docs/Weekly SPRINT 1.docx
@@ -1,6 +1,6 @@
 
 <file path=word/document.xml><?xml version="1.0" encoding="utf-8"?>
-<w:document xmlns:wpc="http://schemas.microsoft.com/office/word/2010/wordprocessingCanvas" xmlns:cx="http://schemas.microsoft.com/office/drawing/2014/chartex" xmlns:cx1="http://schemas.microsoft.com/office/drawing/2015/9/8/chartex" xmlns:cx2="http://schemas.microsoft.com/office/drawing/2015/10/21/chartex" xmlns:cx3="http://schemas.microsoft.com/office/drawing/2016/5/9/chartex" xmlns:cx4="http://schemas.microsoft.com/office/drawing/2016/5/10/chartex" xmlns:cx5="http://schemas.microsoft.com/office/drawing/2016/5/11/chartex" xmlns:cx6="http://schemas.microsoft.com/office/drawing/2016/5/12/chartex" xmlns:cx7="http://schemas.microsoft.com/office/drawing/2016/5/13/chartex" xmlns:cx8="http://schemas.microsoft.com/office/drawing/2016/5/14/chartex" xmlns:mc="http://schemas.openxmlformats.org/markup-compatibility/2006" xmlns:aink="http://schemas.microsoft.com/office/drawing/2016/ink" xmlns:am3d="http://schemas.microsoft.com/office/drawing/2017/model3d" xmlns:o="urn:schemas-microsoft-com:office:office" xmlns:oel="http://schemas.microsoft.com/office/2019/extlst" xmlns:r="http://schemas.openxmlformats.org/officeDocument/2006/relationships" xmlns:m="http://schemas.openxmlformats.org/officeDocument/2006/math" xmlns:v="urn:schemas-microsoft-com:vml" xmlns:wp14="http://schemas.microsoft.com/office/word/2010/wordprocessingDrawing" xmlns:wp="http://schemas.openxmlformats.org/drawingml/2006/wordprocessingDrawing" xmlns:w10="urn:schemas-microsoft-com:office:word" xmlns:w="http://schemas.openxmlformats.org/wordprocessingml/2006/main" xmlns:w14="http://schemas.microsoft.com/office/word/2010/wordml" xmlns:w15="http://schemas.microsoft.com/office/word/2012/wordml" xmlns:w16cex="http://schemas.microsoft.com/office/word/2018/wordml/cex" xmlns:w16cid="http://schemas.microsoft.com/office/word/2016/wordml/cid" xmlns:w16="http://schemas.microsoft.com/office/word/2018/wordml" xmlns:w16du="http://schemas.microsoft.com/office/word/2023/wordml/word16du" xmlns:w16sdtdh="http://schemas.microsoft.com/office/word/2020/wordml/sdtdatahash" xmlns:w16sdtfl="http://schemas.microsoft.com/office/word/2024/wordml/sdtformatlock" xmlns:w16se="http://schemas.microsoft.com/office/word/2015/wordml/symex" xmlns:wpg="http://schemas.microsoft.com/office/word/2010/wordprocessingGroup" xmlns:wpi="http://schemas.microsoft.com/office/word/2010/wordprocessingInk" xmlns:wne="http://schemas.microsoft.com/office/word/2006/wordml" xmlns:wps="http://schemas.microsoft.com/office/word/2010/wordprocessingShape" mc:Ignorable="w14 w15 w16se w16cid w16 w16cex w16sdtdh w16sdtfl w16du wp14">
+<w:document xmlns:wpc="http://schemas.microsoft.com/office/word/2010/wordprocessingCanvas" xmlns:cx="http://schemas.microsoft.com/office/drawing/2014/chartex" xmlns:cx1="http://schemas.microsoft.com/office/drawing/2015/9/8/chartex" xmlns:cx2="http://schemas.microsoft.com/office/drawing/2015/10/21/chartex" xmlns:cx3="http://schemas.microsoft.com/office/drawing/2016/5/9/chartex" xmlns:cx4="http://schemas.microsoft.com/office/drawing/2016/5/10/chartex" xmlns:cx5="http://schemas.microsoft.com/office/drawing/2016/5/11/chartex" xmlns:cx6="http://schemas.microsoft.com/office/drawing/2016/5/12/chartex" xmlns:cx7="http://schemas.microsoft.com/office/drawing/2016/5/13/chartex" xmlns:cx8="http://schemas.microsoft.com/office/drawing/2016/5/14/chartex" xmlns:mc="http://schemas.openxmlformats.org/markup-compatibility/2006" xmlns:aink="http://schemas.microsoft.com/office/drawing/2016/ink" xmlns:am3d="http://schemas.microsoft.com/office/drawing/2017/model3d" xmlns:o="urn:schemas-microsoft-com:office:office" xmlns:oel="http://schemas.microsoft.com/office/2019/extlst" xmlns:r="http://schemas.openxmlformats.org/officeDocument/2006/relationships" xmlns:m="http://schemas.openxmlformats.org/officeDocument/2006/math" xmlns:v="urn:schemas-microsoft-com:vml" xmlns:wp14="http://schemas.microsoft.com/office/word/2010/wordprocessingDrawing" xmlns:wp="http://schemas.openxmlformats.org/drawingml/2006/wordprocessingDrawing" xmlns:w10="urn:schemas-microsoft-com:office:word" xmlns:w="http://schemas.openxmlformats.org/wordprocessingml/2006/main" xmlns:w14="http://schemas.microsoft.com/office/word/2010/wordml" xmlns:w15="http://schemas.microsoft.com/office/word/2012/wordml" xmlns:w16cex="http://schemas.microsoft.com/office/word/2018/wordml/cex" xmlns:w16cid="http://schemas.microsoft.com/office/word/2016/wordml/cid" xmlns:w16="http://schemas.microsoft.com/office/word/2018/wordml" xmlns:w16sdtdh="http://schemas.microsoft.com/office/word/2020/wordml/sdtdatahash" xmlns:w16se="http://schemas.microsoft.com/office/word/2015/wordml/symex" xmlns:wpg="http://schemas.microsoft.com/office/word/2010/wordprocessingGroup" xmlns:wpi="http://schemas.microsoft.com/office/word/2010/wordprocessingInk" xmlns:wne="http://schemas.microsoft.com/office/word/2006/wordml" xmlns:wps="http://schemas.microsoft.com/office/word/2010/wordprocessingShape" mc:Ignorable="w14 w15 w16se w16cid w16 w16cex w16sdtdh wp14">
   <w:body>
     <w:p>
       <w:pPr>
@@ -75,12 +75,6 @@
             </wp14:sizeRelV>
           </wp:anchor>
         </w:drawing>
-      </w:r>
-      <w:r>
-        <w:rPr>
-          <w:rFonts w:ascii="Times New Roman" w:hAnsi="Times New Roman" w:cs="Times New Roman"/>
-          <w:noProof/>
-        </w:rPr>
         <w:drawing>
           <wp:anchor distT="0" distB="0" distL="114300" distR="114300" simplePos="0" relativeHeight="251661312" behindDoc="0" locked="0" layoutInCell="1" allowOverlap="1" wp14:anchorId="214C5A7E" wp14:editId="284C7FC2">
             <wp:simplePos x="0" y="0"/>
@@ -151,7 +145,7 @@
           <w:color w:val="000000" w:themeColor="text1"/>
         </w:rPr>
         <w:drawing>
-          <wp:anchor distT="0" distB="0" distL="114300" distR="114300" simplePos="0" relativeHeight="251662336" behindDoc="0" locked="0" layoutInCell="1" allowOverlap="1" wp14:anchorId="5379183A" wp14:editId="48EEF850">
+          <wp:anchor distT="0" distB="0" distL="114300" distR="114300" simplePos="0" relativeHeight="251662336" behindDoc="0" locked="0" layoutInCell="1" allowOverlap="1" wp14:anchorId="5379183A" wp14:editId="23301C19">
             <wp:simplePos x="0" y="0"/>
             <wp:positionH relativeFrom="column">
               <wp:posOffset>-495300</wp:posOffset>
@@ -492,19 +486,7 @@
         <w:rPr>
           <w:rFonts w:ascii="Times New Roman" w:hAnsi="Times New Roman" w:cs="Times New Roman"/>
         </w:rPr>
-        <w:t>A web</w:t>
-      </w:r>
-      <w:r>
-        <w:rPr>
-          <w:rFonts w:ascii="Times New Roman" w:hAnsi="Times New Roman" w:cs="Times New Roman"/>
-        </w:rPr>
-        <w:t xml:space="preserve"> application, </w:t>
-      </w:r>
-      <w:r>
-        <w:rPr>
-          <w:rFonts w:ascii="Times New Roman" w:hAnsi="Times New Roman" w:cs="Times New Roman"/>
-        </w:rPr>
-        <w:t>attendance system for the College of Science and Technology (CST). Instead of tutors calling out names or passing around a paper sheet, a tutor opens a time-limited check-in code at the start of class, and students check in from their own device. The system checks the code and the student's location, then records attendance automatically. Students, tutors, and admin staff each get a dashboard suited to their role.</w:t>
+        <w:t>A web application, attendance system for the College of Science and Technology (CST). Instead of tutors calling out names or passing around a paper sheet, a tutor opens a time-limited check-in code at the start of class, and students check in from their own device. The system checks the code and the student's location, then records attendance automatically. Students, tutors, and admin staff each get a dashboard suited to their role.</w:t>
       </w:r>
     </w:p>
     <w:p>
@@ -605,12 +587,6 @@
         <w:gridCol w:w="1620"/>
       </w:tblGrid>
       <w:tr>
-        <w:tblPrEx>
-          <w:tblCellMar>
-            <w:top w:w="0" w:type="dxa"/>
-            <w:bottom w:w="0" w:type="dxa"/>
-          </w:tblCellMar>
-        </w:tblPrEx>
         <w:tc>
           <w:tcPr>
             <w:tcW w:w="0" w:type="auto"/>
@@ -715,34 +691,12 @@
                 <w:rFonts w:ascii="Times New Roman" w:hAnsi="Times New Roman" w:cs="Times New Roman"/>
                 <w:color w:val="FFFFFF" w:themeColor="background1"/>
               </w:rPr>
-              <w:t xml:space="preserve">Net </w:t>
-            </w:r>
-            <w:proofErr w:type="gramStart"/>
-            <w:r>
-              <w:rPr>
-                <w:rFonts w:ascii="Times New Roman" w:hAnsi="Times New Roman" w:cs="Times New Roman"/>
-                <w:color w:val="FFFFFF" w:themeColor="background1"/>
-              </w:rPr>
-              <w:t>Capacity(</w:t>
-            </w:r>
-            <w:proofErr w:type="gramEnd"/>
-            <w:r>
-              <w:rPr>
-                <w:rFonts w:ascii="Times New Roman" w:hAnsi="Times New Roman" w:cs="Times New Roman"/>
-                <w:color w:val="FFFFFF" w:themeColor="background1"/>
-              </w:rPr>
-              <w:t>Hours)</w:t>
+              <w:t xml:space="preserve">Net Capacity(Hours)</w:t>
             </w:r>
           </w:p>
         </w:tc>
       </w:tr>
       <w:tr>
-        <w:tblPrEx>
-          <w:tblCellMar>
-            <w:top w:w="0" w:type="dxa"/>
-            <w:bottom w:w="0" w:type="dxa"/>
-          </w:tblCellMar>
-        </w:tblPrEx>
         <w:tc>
           <w:tcPr>
             <w:tcW w:w="0" w:type="auto"/>
@@ -838,12 +792,6 @@
         </w:tc>
       </w:tr>
       <w:tr>
-        <w:tblPrEx>
-          <w:tblCellMar>
-            <w:top w:w="0" w:type="dxa"/>
-            <w:bottom w:w="0" w:type="dxa"/>
-          </w:tblCellMar>
-        </w:tblPrEx>
         <w:tc>
           <w:tcPr>
             <w:tcW w:w="0" w:type="auto"/>
@@ -939,42 +887,28 @@
         </w:tc>
       </w:tr>
       <w:tr>
-        <w:tblPrEx>
-          <w:tblCellMar>
-            <w:top w:w="0" w:type="dxa"/>
-            <w:bottom w:w="0" w:type="dxa"/>
-          </w:tblCellMar>
-        </w:tblPrEx>
-        <w:tc>
-          <w:tcPr>
-            <w:tcW w:w="0" w:type="auto"/>
-            <w:tcMar>
-              <w:top w:w="80" w:type="dxa"/>
-              <w:left w:w="100" w:type="dxa"/>
-              <w:bottom w:w="80" w:type="dxa"/>
-              <w:right w:w="100" w:type="dxa"/>
-            </w:tcMar>
-            <w:vAlign w:val="center"/>
-          </w:tcPr>
-          <w:p>
-            <w:pPr>
-              <w:rPr>
-                <w:rFonts w:ascii="Times New Roman" w:hAnsi="Times New Roman" w:cs="Times New Roman"/>
-              </w:rPr>
-            </w:pPr>
-            <w:proofErr w:type="spellStart"/>
-            <w:r>
-              <w:rPr>
-                <w:rFonts w:ascii="Times New Roman" w:hAnsi="Times New Roman" w:cs="Times New Roman"/>
-              </w:rPr>
-              <w:t>Damchey</w:t>
-            </w:r>
-            <w:proofErr w:type="spellEnd"/>
-            <w:r>
-              <w:rPr>
-                <w:rFonts w:ascii="Times New Roman" w:hAnsi="Times New Roman" w:cs="Times New Roman"/>
-              </w:rPr>
-              <w:t xml:space="preserve"> Lhendup</w:t>
+        <w:tc>
+          <w:tcPr>
+            <w:tcW w:w="0" w:type="auto"/>
+            <w:tcMar>
+              <w:top w:w="80" w:type="dxa"/>
+              <w:left w:w="100" w:type="dxa"/>
+              <w:bottom w:w="80" w:type="dxa"/>
+              <w:right w:w="100" w:type="dxa"/>
+            </w:tcMar>
+            <w:vAlign w:val="center"/>
+          </w:tcPr>
+          <w:p>
+            <w:pPr>
+              <w:rPr>
+                <w:rFonts w:ascii="Times New Roman" w:hAnsi="Times New Roman" w:cs="Times New Roman"/>
+              </w:rPr>
+            </w:pPr>
+            <w:r>
+              <w:rPr>
+                <w:rFonts w:ascii="Times New Roman" w:hAnsi="Times New Roman" w:cs="Times New Roman"/>
+              </w:rPr>
+              <w:t xml:space="preserve">Damchey Lhendup</w:t>
             </w:r>
           </w:p>
         </w:tc>
@@ -1048,12 +982,6 @@
         </w:tc>
       </w:tr>
       <w:tr>
-        <w:tblPrEx>
-          <w:tblCellMar>
-            <w:top w:w="0" w:type="dxa"/>
-            <w:bottom w:w="0" w:type="dxa"/>
-          </w:tblCellMar>
-        </w:tblPrEx>
         <w:tc>
           <w:tcPr>
             <w:tcW w:w="0" w:type="auto"/>
@@ -1149,42 +1077,28 @@
         </w:tc>
       </w:tr>
       <w:tr>
-        <w:tblPrEx>
-          <w:tblCellMar>
-            <w:top w:w="0" w:type="dxa"/>
-            <w:bottom w:w="0" w:type="dxa"/>
-          </w:tblCellMar>
-        </w:tblPrEx>
-        <w:tc>
-          <w:tcPr>
-            <w:tcW w:w="0" w:type="auto"/>
-            <w:tcMar>
-              <w:top w:w="80" w:type="dxa"/>
-              <w:left w:w="100" w:type="dxa"/>
-              <w:bottom w:w="80" w:type="dxa"/>
-              <w:right w:w="100" w:type="dxa"/>
-            </w:tcMar>
-            <w:vAlign w:val="center"/>
-          </w:tcPr>
-          <w:p>
-            <w:pPr>
-              <w:rPr>
-                <w:rFonts w:ascii="Times New Roman" w:hAnsi="Times New Roman" w:cs="Times New Roman"/>
-              </w:rPr>
-            </w:pPr>
-            <w:proofErr w:type="spellStart"/>
-            <w:r>
-              <w:rPr>
-                <w:rFonts w:ascii="Times New Roman" w:hAnsi="Times New Roman" w:cs="Times New Roman"/>
-              </w:rPr>
-              <w:t>Sanjuck</w:t>
-            </w:r>
-            <w:proofErr w:type="spellEnd"/>
-            <w:r>
-              <w:rPr>
-                <w:rFonts w:ascii="Times New Roman" w:hAnsi="Times New Roman" w:cs="Times New Roman"/>
-              </w:rPr>
-              <w:t xml:space="preserve"> Subba</w:t>
+        <w:tc>
+          <w:tcPr>
+            <w:tcW w:w="0" w:type="auto"/>
+            <w:tcMar>
+              <w:top w:w="80" w:type="dxa"/>
+              <w:left w:w="100" w:type="dxa"/>
+              <w:bottom w:w="80" w:type="dxa"/>
+              <w:right w:w="100" w:type="dxa"/>
+            </w:tcMar>
+            <w:vAlign w:val="center"/>
+          </w:tcPr>
+          <w:p>
+            <w:pPr>
+              <w:rPr>
+                <w:rFonts w:ascii="Times New Roman" w:hAnsi="Times New Roman" w:cs="Times New Roman"/>
+              </w:rPr>
+            </w:pPr>
+            <w:r>
+              <w:rPr>
+                <w:rFonts w:ascii="Times New Roman" w:hAnsi="Times New Roman" w:cs="Times New Roman"/>
+              </w:rPr>
+              <w:t xml:space="preserve">Sanjuck Subba</w:t>
             </w:r>
           </w:p>
         </w:tc>
@@ -1430,14 +1344,7 @@
           <w:rFonts w:ascii="Times New Roman" w:hAnsi="Times New Roman" w:cs="Times New Roman"/>
           <w:color w:val="000000" w:themeColor="text1"/>
         </w:rPr>
-        <w:t>1.</w:t>
-      </w:r>
-      <w:r>
-        <w:rPr>
-          <w:rFonts w:ascii="Times New Roman" w:hAnsi="Times New Roman" w:cs="Times New Roman"/>
-          <w:color w:val="000000" w:themeColor="text1"/>
-        </w:rPr>
-        <w:t>2 Task Breakdown</w:t>
+        <w:t>1.2 Task Breakdown</w:t>
       </w:r>
     </w:p>
     <w:tbl>
@@ -1465,12 +1372,6 @@
         <w:gridCol w:w="880"/>
       </w:tblGrid>
       <w:tr>
-        <w:tblPrEx>
-          <w:tblCellMar>
-            <w:top w:w="0" w:type="dxa"/>
-            <w:bottom w:w="0" w:type="dxa"/>
-          </w:tblCellMar>
-        </w:tblPrEx>
         <w:tc>
           <w:tcPr>
             <w:tcW w:w="0" w:type="auto"/>
@@ -1618,12 +1519,6 @@
         </w:tc>
       </w:tr>
       <w:tr>
-        <w:tblPrEx>
-          <w:tblCellMar>
-            <w:top w:w="0" w:type="dxa"/>
-            <w:bottom w:w="0" w:type="dxa"/>
-          </w:tblCellMar>
-        </w:tblPrEx>
         <w:tc>
           <w:tcPr>
             <w:tcW w:w="0" w:type="auto"/>
@@ -1666,19 +1561,11 @@
                 <w:rFonts w:ascii="Times New Roman" w:hAnsi="Times New Roman" w:cs="Times New Roman"/>
               </w:rPr>
             </w:pPr>
-            <w:proofErr w:type="gramStart"/>
-            <w:r>
-              <w:rPr>
-                <w:rFonts w:ascii="Times New Roman" w:hAnsi="Times New Roman" w:cs="Times New Roman"/>
-              </w:rPr>
-              <w:t>Interview  students</w:t>
-            </w:r>
-            <w:proofErr w:type="gramEnd"/>
-            <w:r>
-              <w:rPr>
-                <w:rFonts w:ascii="Times New Roman" w:hAnsi="Times New Roman" w:cs="Times New Roman"/>
-              </w:rPr>
-              <w:t xml:space="preserve"> about their check-in experience, attendance pain points, and what they'd want from the system.</w:t>
+            <w:r>
+              <w:rPr>
+                <w:rFonts w:ascii="Times New Roman" w:hAnsi="Times New Roman" w:cs="Times New Roman"/>
+              </w:rPr>
+              <w:t xml:space="preserve">Interview  students about their check-in experience, attendance pain points, and what they'd want from the system.</w:t>
             </w:r>
           </w:p>
         </w:tc>
@@ -1728,16 +1615,8 @@
               <w:rPr>
                 <w:rFonts w:ascii="Times New Roman" w:hAnsi="Times New Roman" w:cs="Times New Roman"/>
               </w:rPr>
-              <w:t xml:space="preserve">8 </w:t>
-            </w:r>
-            <w:proofErr w:type="spellStart"/>
-            <w:r>
-              <w:rPr>
-                <w:rFonts w:ascii="Times New Roman" w:hAnsi="Times New Roman" w:cs="Times New Roman"/>
-              </w:rPr>
-              <w:t>hrs</w:t>
-            </w:r>
-            <w:proofErr w:type="spellEnd"/>
+              <w:t xml:space="preserve">8 hrs</w:t>
+            </w:r>
           </w:p>
         </w:tc>
         <w:tc>
@@ -1767,12 +1646,6 @@
         </w:tc>
       </w:tr>
       <w:tr>
-        <w:tblPrEx>
-          <w:tblCellMar>
-            <w:top w:w="0" w:type="dxa"/>
-            <w:bottom w:w="0" w:type="dxa"/>
-          </w:tblCellMar>
-        </w:tblPrEx>
         <w:tc>
           <w:tcPr>
             <w:tcW w:w="0" w:type="auto"/>
@@ -1819,19 +1692,7 @@
               <w:rPr>
                 <w:rFonts w:ascii="Times New Roman" w:hAnsi="Times New Roman" w:cs="Times New Roman"/>
               </w:rPr>
-              <w:t>Interview</w:t>
-            </w:r>
-            <w:r>
-              <w:rPr>
-                <w:rFonts w:ascii="Times New Roman" w:hAnsi="Times New Roman" w:cs="Times New Roman"/>
-              </w:rPr>
-              <w:t xml:space="preserve"> some</w:t>
-            </w:r>
-            <w:r>
-              <w:rPr>
-                <w:rFonts w:ascii="Times New Roman" w:hAnsi="Times New Roman" w:cs="Times New Roman"/>
-              </w:rPr>
-              <w:t xml:space="preserve"> tutors about their current attendance workflow and what they'd want from a tutor dashboard.</w:t>
+              <w:t>Interview some tutors about their current attendance workflow and what they'd want from a tutor dashboard.</w:t>
             </w:r>
           </w:p>
         </w:tc>
@@ -1881,22 +1742,8 @@
               <w:rPr>
                 <w:rFonts w:ascii="Times New Roman" w:hAnsi="Times New Roman" w:cs="Times New Roman"/>
               </w:rPr>
-              <w:t>6</w:t>
-            </w:r>
-            <w:r>
-              <w:rPr>
-                <w:rFonts w:ascii="Times New Roman" w:hAnsi="Times New Roman" w:cs="Times New Roman"/>
-              </w:rPr>
-              <w:t xml:space="preserve"> </w:t>
-            </w:r>
-            <w:proofErr w:type="spellStart"/>
-            <w:r>
-              <w:rPr>
-                <w:rFonts w:ascii="Times New Roman" w:hAnsi="Times New Roman" w:cs="Times New Roman"/>
-              </w:rPr>
-              <w:t>hrs</w:t>
-            </w:r>
-            <w:proofErr w:type="spellEnd"/>
+              <w:t xml:space="preserve">6 hrs</w:t>
+            </w:r>
           </w:p>
         </w:tc>
         <w:tc>
@@ -1926,12 +1773,6 @@
         </w:tc>
       </w:tr>
       <w:tr>
-        <w:tblPrEx>
-          <w:tblCellMar>
-            <w:top w:w="0" w:type="dxa"/>
-            <w:bottom w:w="0" w:type="dxa"/>
-          </w:tblCellMar>
-        </w:tblPrEx>
         <w:tc>
           <w:tcPr>
             <w:tcW w:w="0" w:type="auto"/>
@@ -1978,31 +1819,7 @@
               <w:rPr>
                 <w:rFonts w:ascii="Times New Roman" w:hAnsi="Times New Roman" w:cs="Times New Roman"/>
               </w:rPr>
-              <w:t>Interview A</w:t>
-            </w:r>
-            <w:r>
-              <w:rPr>
-                <w:rFonts w:ascii="Times New Roman" w:hAnsi="Times New Roman" w:cs="Times New Roman"/>
-              </w:rPr>
-              <w:t xml:space="preserve">cademic </w:t>
-            </w:r>
-            <w:r>
-              <w:rPr>
-                <w:rFonts w:ascii="Times New Roman" w:hAnsi="Times New Roman" w:cs="Times New Roman"/>
-              </w:rPr>
-              <w:t>A</w:t>
-            </w:r>
-            <w:r>
-              <w:rPr>
-                <w:rFonts w:ascii="Times New Roman" w:hAnsi="Times New Roman" w:cs="Times New Roman"/>
-              </w:rPr>
-              <w:t>ffairs</w:t>
-            </w:r>
-            <w:r>
-              <w:rPr>
-                <w:rFonts w:ascii="Times New Roman" w:hAnsi="Times New Roman" w:cs="Times New Roman"/>
-              </w:rPr>
-              <w:t xml:space="preserve"> and ICT admin contacts about reporting needs and data/access concerns.</w:t>
+              <w:t>Interview Academic Affairs and ICT admin contacts about reporting needs and data/access concerns.</w:t>
             </w:r>
           </w:p>
         </w:tc>
@@ -2052,22 +1869,8 @@
               <w:rPr>
                 <w:rFonts w:ascii="Times New Roman" w:hAnsi="Times New Roman" w:cs="Times New Roman"/>
               </w:rPr>
-              <w:t>7</w:t>
-            </w:r>
-            <w:r>
-              <w:rPr>
-                <w:rFonts w:ascii="Times New Roman" w:hAnsi="Times New Roman" w:cs="Times New Roman"/>
-              </w:rPr>
-              <w:t xml:space="preserve"> </w:t>
-            </w:r>
-            <w:proofErr w:type="spellStart"/>
-            <w:r>
-              <w:rPr>
-                <w:rFonts w:ascii="Times New Roman" w:hAnsi="Times New Roman" w:cs="Times New Roman"/>
-              </w:rPr>
-              <w:t>hrs</w:t>
-            </w:r>
-            <w:proofErr w:type="spellEnd"/>
+              <w:t xml:space="preserve">7 hrs</w:t>
+            </w:r>
           </w:p>
         </w:tc>
         <w:tc>
@@ -2097,12 +1900,6 @@
         </w:tc>
       </w:tr>
       <w:tr>
-        <w:tblPrEx>
-          <w:tblCellMar>
-            <w:top w:w="0" w:type="dxa"/>
-            <w:bottom w:w="0" w:type="dxa"/>
-          </w:tblCellMar>
-        </w:tblPrEx>
         <w:tc>
           <w:tcPr>
             <w:tcW w:w="0" w:type="auto"/>
@@ -2199,16 +1996,8 @@
               <w:rPr>
                 <w:rFonts w:ascii="Times New Roman" w:hAnsi="Times New Roman" w:cs="Times New Roman"/>
               </w:rPr>
-              <w:t xml:space="preserve">6 </w:t>
-            </w:r>
-            <w:proofErr w:type="spellStart"/>
-            <w:r>
-              <w:rPr>
-                <w:rFonts w:ascii="Times New Roman" w:hAnsi="Times New Roman" w:cs="Times New Roman"/>
-              </w:rPr>
-              <w:t>hrs</w:t>
-            </w:r>
-            <w:proofErr w:type="spellEnd"/>
+              <w:t xml:space="preserve">6 hrs</w:t>
+            </w:r>
           </w:p>
         </w:tc>
         <w:tc>
@@ -2238,12 +2027,6 @@
         </w:tc>
       </w:tr>
       <w:tr>
-        <w:tblPrEx>
-          <w:tblCellMar>
-            <w:top w:w="0" w:type="dxa"/>
-            <w:bottom w:w="0" w:type="dxa"/>
-          </w:tblCellMar>
-        </w:tblPrEx>
         <w:tc>
           <w:tcPr>
             <w:tcW w:w="0" w:type="auto"/>
@@ -2341,22 +2124,8 @@
               <w:rPr>
                 <w:rFonts w:ascii="Times New Roman" w:hAnsi="Times New Roman" w:cs="Times New Roman"/>
               </w:rPr>
-              <w:t>9</w:t>
-            </w:r>
-            <w:r>
-              <w:rPr>
-                <w:rFonts w:ascii="Times New Roman" w:hAnsi="Times New Roman" w:cs="Times New Roman"/>
-              </w:rPr>
-              <w:t xml:space="preserve"> </w:t>
-            </w:r>
-            <w:proofErr w:type="spellStart"/>
-            <w:r>
-              <w:rPr>
-                <w:rFonts w:ascii="Times New Roman" w:hAnsi="Times New Roman" w:cs="Times New Roman"/>
-              </w:rPr>
-              <w:t>hrs</w:t>
-            </w:r>
-            <w:proofErr w:type="spellEnd"/>
+              <w:t xml:space="preserve">9 hrs</w:t>
+            </w:r>
           </w:p>
         </w:tc>
         <w:tc>
@@ -2386,12 +2155,6 @@
         </w:tc>
       </w:tr>
       <w:tr>
-        <w:tblPrEx>
-          <w:tblCellMar>
-            <w:top w:w="0" w:type="dxa"/>
-            <w:bottom w:w="0" w:type="dxa"/>
-          </w:tblCellMar>
-        </w:tblPrEx>
         <w:tc>
           <w:tcPr>
             <w:tcW w:w="0" w:type="auto"/>
@@ -2488,22 +2251,8 @@
               <w:rPr>
                 <w:rFonts w:ascii="Times New Roman" w:hAnsi="Times New Roman" w:cs="Times New Roman"/>
               </w:rPr>
-              <w:t>8</w:t>
-            </w:r>
-            <w:r>
-              <w:rPr>
-                <w:rFonts w:ascii="Times New Roman" w:hAnsi="Times New Roman" w:cs="Times New Roman"/>
-              </w:rPr>
-              <w:t xml:space="preserve"> </w:t>
-            </w:r>
-            <w:proofErr w:type="spellStart"/>
-            <w:r>
-              <w:rPr>
-                <w:rFonts w:ascii="Times New Roman" w:hAnsi="Times New Roman" w:cs="Times New Roman"/>
-              </w:rPr>
-              <w:t>hrs</w:t>
-            </w:r>
-            <w:proofErr w:type="spellEnd"/>
+              <w:t xml:space="preserve">8 hrs</w:t>
+            </w:r>
           </w:p>
         </w:tc>
         <w:tc>
@@ -2533,12 +2282,6 @@
         </w:tc>
       </w:tr>
       <w:tr>
-        <w:tblPrEx>
-          <w:tblCellMar>
-            <w:top w:w="0" w:type="dxa"/>
-            <w:bottom w:w="0" w:type="dxa"/>
-          </w:tblCellMar>
-        </w:tblPrEx>
         <w:tc>
           <w:tcPr>
             <w:tcW w:w="0" w:type="auto"/>
@@ -2635,22 +2378,8 @@
               <w:rPr>
                 <w:rFonts w:ascii="Times New Roman" w:hAnsi="Times New Roman" w:cs="Times New Roman"/>
               </w:rPr>
-              <w:t>8</w:t>
-            </w:r>
-            <w:r>
-              <w:rPr>
-                <w:rFonts w:ascii="Times New Roman" w:hAnsi="Times New Roman" w:cs="Times New Roman"/>
-              </w:rPr>
-              <w:t xml:space="preserve"> </w:t>
-            </w:r>
-            <w:proofErr w:type="spellStart"/>
-            <w:r>
-              <w:rPr>
-                <w:rFonts w:ascii="Times New Roman" w:hAnsi="Times New Roman" w:cs="Times New Roman"/>
-              </w:rPr>
-              <w:t>hrs</w:t>
-            </w:r>
-            <w:proofErr w:type="spellEnd"/>
+              <w:t xml:space="preserve">8 hrs</w:t>
+            </w:r>
           </w:p>
         </w:tc>
         <w:tc>
@@ -2680,12 +2409,6 @@
         </w:tc>
       </w:tr>
       <w:tr>
-        <w:tblPrEx>
-          <w:tblCellMar>
-            <w:top w:w="0" w:type="dxa"/>
-            <w:bottom w:w="0" w:type="dxa"/>
-          </w:tblCellMar>
-        </w:tblPrEx>
         <w:tc>
           <w:tcPr>
             <w:tcW w:w="0" w:type="auto"/>
@@ -2782,91 +2505,59 @@
               <w:rPr>
                 <w:rFonts w:ascii="Times New Roman" w:hAnsi="Times New Roman" w:cs="Times New Roman"/>
               </w:rPr>
-              <w:t>2</w:t>
-            </w:r>
-            <w:r>
-              <w:rPr>
-                <w:rFonts w:ascii="Times New Roman" w:hAnsi="Times New Roman" w:cs="Times New Roman"/>
-              </w:rPr>
-              <w:t xml:space="preserve"> </w:t>
-            </w:r>
-            <w:proofErr w:type="spellStart"/>
-            <w:r>
-              <w:rPr>
-                <w:rFonts w:ascii="Times New Roman" w:hAnsi="Times New Roman" w:cs="Times New Roman"/>
-              </w:rPr>
-              <w:t>hrs</w:t>
-            </w:r>
-            <w:proofErr w:type="spellEnd"/>
-          </w:p>
-        </w:tc>
-        <w:tc>
-          <w:tcPr>
-            <w:tcW w:w="0" w:type="auto"/>
-            <w:tcMar>
-              <w:top w:w="80" w:type="dxa"/>
-              <w:left w:w="100" w:type="dxa"/>
-              <w:bottom w:w="80" w:type="dxa"/>
-              <w:right w:w="100" w:type="dxa"/>
-            </w:tcMar>
-            <w:vAlign w:val="center"/>
-          </w:tcPr>
-          <w:p>
-            <w:pPr>
-              <w:rPr>
-                <w:rFonts w:ascii="Times New Roman" w:hAnsi="Times New Roman" w:cs="Times New Roman"/>
-              </w:rPr>
-            </w:pPr>
-            <w:r>
-              <w:rPr>
-                <w:rFonts w:ascii="Times New Roman" w:hAnsi="Times New Roman" w:cs="Times New Roman"/>
-              </w:rPr>
-              <w:t>Not Started</w:t>
+              <w:t xml:space="preserve">2 hrs</w:t>
+            </w:r>
+          </w:p>
+        </w:tc>
+        <w:tc>
+          <w:tcPr>
+            <w:tcW w:w="0" w:type="auto"/>
+            <w:tcMar>
+              <w:top w:w="80" w:type="dxa"/>
+              <w:left w:w="100" w:type="dxa"/>
+              <w:bottom w:w="80" w:type="dxa"/>
+              <w:right w:w="100" w:type="dxa"/>
+            </w:tcMar>
+            <w:vAlign w:val="center"/>
+          </w:tcPr>
+          <w:p>
+            <w:pPr>
+              <w:rPr>
+                <w:rFonts w:ascii="Times New Roman" w:hAnsi="Times New Roman" w:cs="Times New Roman"/>
+              </w:rPr>
+            </w:pPr>
+            <w:r>
+              <w:rPr>
+                <w:rFonts w:ascii="Times New Roman" w:hAnsi="Times New Roman" w:cs="Times New Roman"/>
+              </w:rPr>
+              <w:t>Completed</w:t>
             </w:r>
           </w:p>
         </w:tc>
       </w:tr>
       <w:tr>
-        <w:tblPrEx>
-          <w:tblCellMar>
-            <w:top w:w="0" w:type="dxa"/>
-            <w:bottom w:w="0" w:type="dxa"/>
-          </w:tblCellMar>
-        </w:tblPrEx>
-        <w:tc>
-          <w:tcPr>
-            <w:tcW w:w="0" w:type="auto"/>
-            <w:tcMar>
-              <w:top w:w="80" w:type="dxa"/>
-              <w:left w:w="100" w:type="dxa"/>
-              <w:bottom w:w="80" w:type="dxa"/>
-              <w:right w:w="100" w:type="dxa"/>
-            </w:tcMar>
-            <w:vAlign w:val="center"/>
-          </w:tcPr>
-          <w:p>
-            <w:pPr>
-              <w:rPr>
-                <w:rFonts w:ascii="Times New Roman" w:hAnsi="Times New Roman" w:cs="Times New Roman"/>
-              </w:rPr>
-            </w:pPr>
-            <w:r>
-              <w:rPr>
-                <w:rFonts w:ascii="Times New Roman" w:hAnsi="Times New Roman" w:cs="Times New Roman"/>
-              </w:rPr>
-              <w:t>2</w:t>
-            </w:r>
-            <w:r>
-              <w:rPr>
-                <w:rFonts w:ascii="Times New Roman" w:hAnsi="Times New Roman" w:cs="Times New Roman"/>
-              </w:rPr>
-              <w:t>09</w:t>
-            </w:r>
-            <w:r>
-              <w:rPr>
-                <w:rFonts w:ascii="Times New Roman" w:hAnsi="Times New Roman" w:cs="Times New Roman"/>
-              </w:rPr>
-              <w:t>(stretch)</w:t>
+        <w:tc>
+          <w:tcPr>
+            <w:tcW w:w="0" w:type="auto"/>
+            <w:tcMar>
+              <w:top w:w="80" w:type="dxa"/>
+              <w:left w:w="100" w:type="dxa"/>
+              <w:bottom w:w="80" w:type="dxa"/>
+              <w:right w:w="100" w:type="dxa"/>
+            </w:tcMar>
+            <w:vAlign w:val="center"/>
+          </w:tcPr>
+          <w:p>
+            <w:pPr>
+              <w:rPr>
+                <w:rFonts w:ascii="Times New Roman" w:hAnsi="Times New Roman" w:cs="Times New Roman"/>
+              </w:rPr>
+            </w:pPr>
+            <w:r>
+              <w:rPr>
+                <w:rFonts w:ascii="Times New Roman" w:hAnsi="Times New Roman" w:cs="Times New Roman"/>
+              </w:rPr>
+              <w:t>209(stretch)</w:t>
             </w:r>
           </w:p>
         </w:tc>
@@ -2941,16 +2632,8 @@
               <w:rPr>
                 <w:rFonts w:ascii="Times New Roman" w:hAnsi="Times New Roman" w:cs="Times New Roman"/>
               </w:rPr>
-              <w:t xml:space="preserve">3 </w:t>
-            </w:r>
-            <w:proofErr w:type="spellStart"/>
-            <w:r>
-              <w:rPr>
-                <w:rFonts w:ascii="Times New Roman" w:hAnsi="Times New Roman" w:cs="Times New Roman"/>
-              </w:rPr>
-              <w:t>hrs</w:t>
-            </w:r>
-            <w:proofErr w:type="spellEnd"/>
+              <w:t xml:space="preserve">3 hrs</w:t>
+            </w:r>
           </w:p>
         </w:tc>
         <w:tc>
@@ -3201,16 +2884,7 @@
                 <w:sz w:val="24"/>
                 <w:szCs w:val="24"/>
               </w:rPr>
-              <w:t>T20</w:t>
-            </w:r>
-            <w:r>
-              <w:rPr>
-                <w:rFonts w:ascii="Times New Roman" w:hAnsi="Times New Roman" w:cs="Times New Roman"/>
-                <w:color w:val="auto"/>
-                <w:sz w:val="24"/>
-                <w:szCs w:val="24"/>
-              </w:rPr>
-              <w:t>6</w:t>
+              <w:t>T206</w:t>
             </w:r>
           </w:p>
         </w:tc>
@@ -3240,16 +2914,7 @@
                 <w:sz w:val="24"/>
                 <w:szCs w:val="24"/>
               </w:rPr>
-              <w:t xml:space="preserve">Login and Student Dashboard </w:t>
-            </w:r>
-            <w:r>
-              <w:rPr>
-                <w:rFonts w:ascii="Times New Roman" w:hAnsi="Times New Roman" w:cs="Times New Roman"/>
-                <w:color w:val="auto"/>
-                <w:sz w:val="24"/>
-                <w:szCs w:val="24"/>
-              </w:rPr>
-              <w:t>Figma</w:t>
+              <w:t>Login and Student Dashboard Figma</w:t>
             </w:r>
           </w:p>
         </w:tc>
@@ -3279,19 +2944,8 @@
                 <w:sz w:val="24"/>
                 <w:szCs w:val="24"/>
               </w:rPr>
-              <w:t xml:space="preserve">9 </w:t>
-            </w:r>
-            <w:proofErr w:type="spellStart"/>
-            <w:r>
-              <w:rPr>
-                <w:rFonts w:ascii="Times New Roman" w:hAnsi="Times New Roman" w:cs="Times New Roman"/>
-                <w:color w:val="auto"/>
-                <w:sz w:val="24"/>
-                <w:szCs w:val="24"/>
-              </w:rPr>
-              <w:t>hrs</w:t>
-            </w:r>
-            <w:proofErr w:type="spellEnd"/>
+              <w:t xml:space="preserve">9 hrs</w:t>
+            </w:r>
           </w:p>
         </w:tc>
       </w:tr>
@@ -3315,7 +2969,6 @@
                 <w:szCs w:val="24"/>
               </w:rPr>
             </w:pPr>
-            <w:proofErr w:type="spellStart"/>
             <w:r>
               <w:rPr>
                 <w:rFonts w:ascii="Times New Roman" w:hAnsi="Times New Roman" w:cs="Times New Roman"/>
@@ -3323,17 +2976,7 @@
                 <w:sz w:val="24"/>
                 <w:szCs w:val="24"/>
               </w:rPr>
-              <w:t>Damchey</w:t>
-            </w:r>
-            <w:proofErr w:type="spellEnd"/>
-            <w:r>
-              <w:rPr>
-                <w:rFonts w:ascii="Times New Roman" w:hAnsi="Times New Roman" w:cs="Times New Roman"/>
-                <w:color w:val="auto"/>
-                <w:sz w:val="24"/>
-                <w:szCs w:val="24"/>
-              </w:rPr>
-              <w:t xml:space="preserve"> Lhendup</w:t>
+              <w:t xml:space="preserve">Damchey Lhendup</w:t>
             </w:r>
           </w:p>
         </w:tc>
@@ -3423,19 +3066,8 @@
                 <w:sz w:val="24"/>
                 <w:szCs w:val="24"/>
               </w:rPr>
-              <w:t xml:space="preserve">8 </w:t>
-            </w:r>
-            <w:proofErr w:type="spellStart"/>
-            <w:r>
-              <w:rPr>
-                <w:rFonts w:ascii="Times New Roman" w:hAnsi="Times New Roman" w:cs="Times New Roman"/>
-                <w:color w:val="auto"/>
-                <w:sz w:val="24"/>
-                <w:szCs w:val="24"/>
-              </w:rPr>
-              <w:t>hrs</w:t>
-            </w:r>
-            <w:proofErr w:type="spellEnd"/>
+              <w:t xml:space="preserve">8 hrs</w:t>
+            </w:r>
           </w:p>
         </w:tc>
       </w:tr>
@@ -3496,16 +3128,7 @@
                 <w:sz w:val="24"/>
                 <w:szCs w:val="24"/>
               </w:rPr>
-              <w:t>T203, T2</w:t>
-            </w:r>
-            <w:r>
-              <w:rPr>
-                <w:rFonts w:ascii="Times New Roman" w:hAnsi="Times New Roman" w:cs="Times New Roman"/>
-                <w:color w:val="auto"/>
-                <w:sz w:val="24"/>
-                <w:szCs w:val="24"/>
-              </w:rPr>
-              <w:t>08</w:t>
+              <w:t>T203, T208</w:t>
             </w:r>
           </w:p>
         </w:tc>
@@ -3565,37 +3188,8 @@
                 <w:sz w:val="24"/>
                 <w:szCs w:val="24"/>
               </w:rPr>
-              <w:t>1</w:t>
-            </w:r>
-            <w:r>
-              <w:rPr>
-                <w:rFonts w:ascii="Times New Roman" w:hAnsi="Times New Roman" w:cs="Times New Roman"/>
-                <w:color w:val="auto"/>
-                <w:sz w:val="24"/>
-                <w:szCs w:val="24"/>
-              </w:rPr>
-              <w:t>1</w:t>
-            </w:r>
-            <w:r>
-              <w:rPr>
-                <w:rFonts w:ascii="Times New Roman" w:hAnsi="Times New Roman" w:cs="Times New Roman"/>
-                <w:color w:val="auto"/>
-                <w:sz w:val="24"/>
-                <w:szCs w:val="24"/>
-              </w:rPr>
-              <w:t xml:space="preserve"> </w:t>
-            </w:r>
-            <w:proofErr w:type="spellStart"/>
-            <w:r>
-              <w:rPr>
-                <w:rFonts w:ascii="Times New Roman" w:hAnsi="Times New Roman" w:cs="Times New Roman"/>
-                <w:color w:val="auto"/>
-                <w:sz w:val="24"/>
-                <w:szCs w:val="24"/>
-              </w:rPr>
-              <w:t>hrs</w:t>
-            </w:r>
-            <w:proofErr w:type="spellEnd"/>
+              <w:t xml:space="preserve">11 hrs</w:t>
+            </w:r>
           </w:p>
         </w:tc>
       </w:tr>
@@ -3656,54 +3250,7 @@
                 <w:sz w:val="24"/>
                 <w:szCs w:val="24"/>
               </w:rPr>
-              <w:t>T20</w:t>
-            </w:r>
-            <w:r>
-              <w:rPr>
-                <w:rFonts w:ascii="Times New Roman" w:hAnsi="Times New Roman" w:cs="Times New Roman"/>
-                <w:color w:val="auto"/>
-                <w:sz w:val="24"/>
-                <w:szCs w:val="24"/>
-              </w:rPr>
-              <w:t>1</w:t>
-            </w:r>
-            <w:r>
-              <w:rPr>
-                <w:rFonts w:ascii="Times New Roman" w:hAnsi="Times New Roman" w:cs="Times New Roman"/>
-                <w:color w:val="auto"/>
-                <w:sz w:val="24"/>
-                <w:szCs w:val="24"/>
-              </w:rPr>
-              <w:t>, T20</w:t>
-            </w:r>
-            <w:r>
-              <w:rPr>
-                <w:rFonts w:ascii="Times New Roman" w:hAnsi="Times New Roman" w:cs="Times New Roman"/>
-                <w:color w:val="auto"/>
-                <w:sz w:val="24"/>
-                <w:szCs w:val="24"/>
-              </w:rPr>
-              <w:t>2, T</w:t>
-            </w:r>
-            <w:proofErr w:type="gramStart"/>
-            <w:r>
-              <w:rPr>
-                <w:rFonts w:ascii="Times New Roman" w:hAnsi="Times New Roman" w:cs="Times New Roman"/>
-                <w:color w:val="auto"/>
-                <w:sz w:val="24"/>
-                <w:szCs w:val="24"/>
-              </w:rPr>
-              <w:t>203,T</w:t>
-            </w:r>
-            <w:proofErr w:type="gramEnd"/>
-            <w:r>
-              <w:rPr>
-                <w:rFonts w:ascii="Times New Roman" w:hAnsi="Times New Roman" w:cs="Times New Roman"/>
-                <w:color w:val="auto"/>
-                <w:sz w:val="24"/>
-                <w:szCs w:val="24"/>
-              </w:rPr>
-              <w:t>204</w:t>
+              <w:t>T201, T202, T203,T204</w:t>
             </w:r>
           </w:p>
         </w:tc>
@@ -3763,37 +3310,8 @@
                 <w:sz w:val="24"/>
                 <w:szCs w:val="24"/>
               </w:rPr>
-              <w:t>1</w:t>
-            </w:r>
-            <w:r>
-              <w:rPr>
-                <w:rFonts w:ascii="Times New Roman" w:hAnsi="Times New Roman" w:cs="Times New Roman"/>
-                <w:color w:val="auto"/>
-                <w:sz w:val="24"/>
-                <w:szCs w:val="24"/>
-              </w:rPr>
-              <w:t>6</w:t>
-            </w:r>
-            <w:r>
-              <w:rPr>
-                <w:rFonts w:ascii="Times New Roman" w:hAnsi="Times New Roman" w:cs="Times New Roman"/>
-                <w:color w:val="auto"/>
-                <w:sz w:val="24"/>
-                <w:szCs w:val="24"/>
-              </w:rPr>
-              <w:t xml:space="preserve"> </w:t>
-            </w:r>
-            <w:proofErr w:type="spellStart"/>
-            <w:r>
-              <w:rPr>
-                <w:rFonts w:ascii="Times New Roman" w:hAnsi="Times New Roman" w:cs="Times New Roman"/>
-                <w:color w:val="auto"/>
-                <w:sz w:val="24"/>
-                <w:szCs w:val="24"/>
-              </w:rPr>
-              <w:t>hrs</w:t>
-            </w:r>
-            <w:proofErr w:type="spellEnd"/>
+              <w:t xml:space="preserve">16 hrs</w:t>
+            </w:r>
           </w:p>
         </w:tc>
       </w:tr>
@@ -3817,7 +3335,6 @@
                 <w:szCs w:val="24"/>
               </w:rPr>
             </w:pPr>
-            <w:proofErr w:type="spellStart"/>
             <w:r>
               <w:rPr>
                 <w:rFonts w:ascii="Times New Roman" w:hAnsi="Times New Roman" w:cs="Times New Roman"/>
@@ -3825,17 +3342,7 @@
                 <w:sz w:val="24"/>
                 <w:szCs w:val="24"/>
               </w:rPr>
-              <w:t>Sanjuck</w:t>
-            </w:r>
-            <w:proofErr w:type="spellEnd"/>
-            <w:r>
-              <w:rPr>
-                <w:rFonts w:ascii="Times New Roman" w:hAnsi="Times New Roman" w:cs="Times New Roman"/>
-                <w:color w:val="auto"/>
-                <w:sz w:val="24"/>
-                <w:szCs w:val="24"/>
-              </w:rPr>
-              <w:t xml:space="preserve"> Subba</w:t>
+              <w:t xml:space="preserve">Sanjuck Subba</w:t>
             </w:r>
           </w:p>
         </w:tc>
@@ -3865,16 +3372,7 @@
                 <w:sz w:val="24"/>
                 <w:szCs w:val="24"/>
               </w:rPr>
-              <w:t>T20</w:t>
-            </w:r>
-            <w:r>
-              <w:rPr>
-                <w:rFonts w:ascii="Times New Roman" w:hAnsi="Times New Roman" w:cs="Times New Roman"/>
-                <w:color w:val="auto"/>
-                <w:sz w:val="24"/>
-                <w:szCs w:val="24"/>
-              </w:rPr>
-              <w:t>7</w:t>
+              <w:t>T207</w:t>
             </w:r>
           </w:p>
         </w:tc>
@@ -3934,28 +3432,8 @@
                 <w:sz w:val="24"/>
                 <w:szCs w:val="24"/>
               </w:rPr>
-              <w:t>7</w:t>
-            </w:r>
-            <w:r>
-              <w:rPr>
-                <w:rFonts w:ascii="Times New Roman" w:hAnsi="Times New Roman" w:cs="Times New Roman"/>
-                <w:color w:val="auto"/>
-                <w:sz w:val="24"/>
-                <w:szCs w:val="24"/>
-              </w:rPr>
-              <w:t xml:space="preserve"> </w:t>
-            </w:r>
-            <w:proofErr w:type="spellStart"/>
-            <w:r>
-              <w:rPr>
-                <w:rFonts w:ascii="Times New Roman" w:hAnsi="Times New Roman" w:cs="Times New Roman"/>
-                <w:color w:val="auto"/>
-                <w:sz w:val="24"/>
-                <w:szCs w:val="24"/>
-              </w:rPr>
-              <w:t>hrs</w:t>
-            </w:r>
-            <w:proofErr w:type="spellEnd"/>
+              <w:t xml:space="preserve">7 hrs</w:t>
+            </w:r>
           </w:p>
         </w:tc>
       </w:tr>
@@ -4016,16 +3494,7 @@
                 <w:sz w:val="24"/>
                 <w:szCs w:val="24"/>
               </w:rPr>
-              <w:t>T2</w:t>
-            </w:r>
-            <w:r>
-              <w:rPr>
-                <w:rFonts w:ascii="Times New Roman" w:hAnsi="Times New Roman" w:cs="Times New Roman"/>
-                <w:color w:val="auto"/>
-                <w:sz w:val="24"/>
-                <w:szCs w:val="24"/>
-              </w:rPr>
-              <w:t>09(Stretch)</w:t>
+              <w:t>T209(Stretch)</w:t>
             </w:r>
           </w:p>
         </w:tc>
@@ -4085,19 +3554,8 @@
                 <w:sz w:val="24"/>
                 <w:szCs w:val="24"/>
               </w:rPr>
-              <w:t xml:space="preserve">3 </w:t>
-            </w:r>
-            <w:proofErr w:type="spellStart"/>
-            <w:r>
-              <w:rPr>
-                <w:rFonts w:ascii="Times New Roman" w:hAnsi="Times New Roman" w:cs="Times New Roman"/>
-                <w:color w:val="auto"/>
-                <w:sz w:val="24"/>
-                <w:szCs w:val="24"/>
-              </w:rPr>
-              <w:t>hrs</w:t>
-            </w:r>
-            <w:proofErr w:type="spellEnd"/>
+              <w:t xml:space="preserve">3 hrs</w:t>
+            </w:r>
           </w:p>
         </w:tc>
       </w:tr>
@@ -4131,11 +3589,41 @@
         <w:t>Total Time: 54 Hours</w:t>
       </w:r>
     </w:p>
-    <w:p/>
-    <w:p/>
-    <w:p/>
-    <w:p/>
-    <w:p/>
+    <w:p>
+      <w:pPr>
+        <w:rPr>
+          <w:rFonts w:ascii="Times New Roman" w:hAnsi="Times New Roman" w:cs="Times New Roman"/>
+        </w:rPr>
+      </w:pPr>
+    </w:p>
+    <w:p>
+      <w:pPr>
+        <w:rPr>
+          <w:rFonts w:ascii="Times New Roman" w:hAnsi="Times New Roman" w:cs="Times New Roman"/>
+        </w:rPr>
+      </w:pPr>
+    </w:p>
+    <w:p>
+      <w:pPr>
+        <w:rPr>
+          <w:rFonts w:ascii="Times New Roman" w:hAnsi="Times New Roman" w:cs="Times New Roman"/>
+        </w:rPr>
+      </w:pPr>
+    </w:p>
+    <w:p>
+      <w:pPr>
+        <w:rPr>
+          <w:rFonts w:ascii="Times New Roman" w:hAnsi="Times New Roman" w:cs="Times New Roman"/>
+        </w:rPr>
+      </w:pPr>
+    </w:p>
+    <w:p>
+      <w:pPr>
+        <w:rPr>
+          <w:rFonts w:ascii="Times New Roman" w:hAnsi="Times New Roman" w:cs="Times New Roman"/>
+        </w:rPr>
+      </w:pPr>
+    </w:p>
     <w:p>
       <w:pPr>
         <w:pStyle w:val="Heading1"/>
@@ -4150,7 +3638,6 @@
           <w:rFonts w:ascii="Times New Roman" w:hAnsi="Times New Roman" w:cs="Times New Roman"/>
           <w:color w:val="auto"/>
         </w:rPr>
-        <w:lastRenderedPageBreak/>
         <w:t>3. Sprint Progress</w:t>
       </w:r>
     </w:p>
@@ -4184,23 +3671,7 @@
           <w:i/>
           <w:iCs/>
         </w:rPr>
-        <w:t xml:space="preserve">[Insert burndown chart once the sprint is underway — track how many of the </w:t>
-      </w:r>
-      <w:r>
-        <w:rPr>
-          <w:rFonts w:ascii="Times New Roman" w:hAnsi="Times New Roman" w:cs="Times New Roman"/>
-          <w:i/>
-          <w:iCs/>
-        </w:rPr>
-        <w:t>9</w:t>
-      </w:r>
-      <w:r>
-        <w:rPr>
-          <w:rFonts w:ascii="Times New Roman" w:hAnsi="Times New Roman" w:cs="Times New Roman"/>
-          <w:i/>
-          <w:iCs/>
-        </w:rPr>
-        <w:t>core tasks are done, day by day.]</w:t>
+        <w:t>[Insert burndown chart once the sprint is underway — track how many of the 9core tasks are done, day by day.]</w:t>
       </w:r>
     </w:p>
     <w:p>
@@ -4217,6 +3688,7 @@
           <w:rFonts w:ascii="Times New Roman" w:hAnsi="Times New Roman" w:cs="Times New Roman"/>
           <w:color w:val="auto"/>
         </w:rPr>
+        <w:lastRenderedPageBreak/>
         <w:t>3.2 Daily Standup Summary</w:t>
       </w:r>
     </w:p>
@@ -4256,18 +3728,12 @@
         <w:tblLook w:val="0000" w:firstRow="0" w:lastRow="0" w:firstColumn="0" w:lastColumn="0" w:noHBand="0" w:noVBand="0"/>
       </w:tblPr>
       <w:tblGrid>
-        <w:gridCol w:w="1656"/>
-        <w:gridCol w:w="2193"/>
-        <w:gridCol w:w="3751"/>
-        <w:gridCol w:w="2400"/>
+        <w:gridCol w:w="763"/>
+        <w:gridCol w:w="5646"/>
+        <w:gridCol w:w="2391"/>
+        <w:gridCol w:w="1200"/>
       </w:tblGrid>
       <w:tr>
-        <w:tblPrEx>
-          <w:tblCellMar>
-            <w:top w:w="0" w:type="dxa"/>
-            <w:bottom w:w="0" w:type="dxa"/>
-          </w:tblCellMar>
-        </w:tblPrEx>
         <w:tc>
           <w:tcPr>
             <w:tcW w:w="0" w:type="auto"/>
@@ -4390,12 +3856,6 @@
         </w:tc>
       </w:tr>
       <w:tr>
-        <w:tblPrEx>
-          <w:tblCellMar>
-            <w:top w:w="0" w:type="dxa"/>
-            <w:bottom w:w="0" w:type="dxa"/>
-          </w:tblCellMar>
-        </w:tblPrEx>
         <w:tc>
           <w:tcPr>
             <w:tcW w:w="0" w:type="auto"/>
@@ -4438,54 +3898,66 @@
                 <w:rFonts w:ascii="Times New Roman" w:hAnsi="Times New Roman" w:cs="Times New Roman"/>
               </w:rPr>
             </w:pPr>
-          </w:p>
-        </w:tc>
-        <w:tc>
-          <w:tcPr>
-            <w:tcW w:w="0" w:type="auto"/>
-            <w:tcMar>
-              <w:top w:w="80" w:type="dxa"/>
-              <w:left w:w="100" w:type="dxa"/>
-              <w:bottom w:w="80" w:type="dxa"/>
-              <w:right w:w="100" w:type="dxa"/>
-            </w:tcMar>
-            <w:vAlign w:val="center"/>
-          </w:tcPr>
-          <w:p>
-            <w:pPr>
-              <w:rPr>
-                <w:rFonts w:ascii="Times New Roman" w:hAnsi="Times New Roman" w:cs="Times New Roman"/>
-              </w:rPr>
-            </w:pPr>
-          </w:p>
-        </w:tc>
-        <w:tc>
-          <w:tcPr>
-            <w:tcW w:w="0" w:type="auto"/>
-            <w:tcMar>
-              <w:top w:w="80" w:type="dxa"/>
-              <w:left w:w="100" w:type="dxa"/>
-              <w:bottom w:w="80" w:type="dxa"/>
-              <w:right w:w="100" w:type="dxa"/>
-            </w:tcMar>
-            <w:vAlign w:val="center"/>
-          </w:tcPr>
-          <w:p>
-            <w:pPr>
-              <w:rPr>
-                <w:rFonts w:ascii="Times New Roman" w:hAnsi="Times New Roman" w:cs="Times New Roman"/>
-              </w:rPr>
-            </w:pPr>
+            <w:r>
+              <w:rPr>
+                <w:rFonts w:ascii="Times New Roman" w:hAnsi="Times New Roman" w:cs="Times New Roman"/>
+              </w:rPr>
+              <w:t>Team discussion on design features and requirements direction (Login, Student, Tutor, Admin/DAA dashboards) to align before individual task work started.</w:t>
+            </w:r>
+          </w:p>
+        </w:tc>
+        <w:tc>
+          <w:tcPr>
+            <w:tcW w:w="0" w:type="auto"/>
+            <w:tcMar>
+              <w:top w:w="80" w:type="dxa"/>
+              <w:left w:w="100" w:type="dxa"/>
+              <w:bottom w:w="80" w:type="dxa"/>
+              <w:right w:w="100" w:type="dxa"/>
+            </w:tcMar>
+            <w:vAlign w:val="center"/>
+          </w:tcPr>
+          <w:p>
+            <w:pPr>
+              <w:rPr>
+                <w:rFonts w:ascii="Times New Roman" w:hAnsi="Times New Roman" w:cs="Times New Roman"/>
+              </w:rPr>
+            </w:pPr>
+            <w:r>
+              <w:rPr>
+                <w:rFonts w:ascii="Times New Roman" w:hAnsi="Times New Roman" w:cs="Times New Roman"/>
+              </w:rPr>
+              <w:t>Begin individual task work: Figma designs, requirement interviews, repo setup.</w:t>
+            </w:r>
+          </w:p>
+        </w:tc>
+        <w:tc>
+          <w:tcPr>
+            <w:tcW w:w="0" w:type="auto"/>
+            <w:tcMar>
+              <w:top w:w="80" w:type="dxa"/>
+              <w:left w:w="100" w:type="dxa"/>
+              <w:bottom w:w="80" w:type="dxa"/>
+              <w:right w:w="100" w:type="dxa"/>
+            </w:tcMar>
+            <w:vAlign w:val="center"/>
+          </w:tcPr>
+          <w:p>
+            <w:pPr>
+              <w:rPr>
+                <w:rFonts w:ascii="Times New Roman" w:hAnsi="Times New Roman" w:cs="Times New Roman"/>
+              </w:rPr>
+            </w:pPr>
+            <w:r>
+              <w:rPr>
+                <w:rFonts w:ascii="Times New Roman" w:hAnsi="Times New Roman" w:cs="Times New Roman"/>
+              </w:rPr>
+              <w:t>None</w:t>
+            </w:r>
           </w:p>
         </w:tc>
       </w:tr>
       <w:tr>
-        <w:tblPrEx>
-          <w:tblCellMar>
-            <w:top w:w="0" w:type="dxa"/>
-            <w:bottom w:w="0" w:type="dxa"/>
-          </w:tblCellMar>
-        </w:tblPrEx>
         <w:tc>
           <w:tcPr>
             <w:tcW w:w="0" w:type="auto"/>
@@ -4528,54 +4000,66 @@
                 <w:rFonts w:ascii="Times New Roman" w:hAnsi="Times New Roman" w:cs="Times New Roman"/>
               </w:rPr>
             </w:pPr>
-          </w:p>
-        </w:tc>
-        <w:tc>
-          <w:tcPr>
-            <w:tcW w:w="0" w:type="auto"/>
-            <w:tcMar>
-              <w:top w:w="80" w:type="dxa"/>
-              <w:left w:w="100" w:type="dxa"/>
-              <w:bottom w:w="80" w:type="dxa"/>
-              <w:right w:w="100" w:type="dxa"/>
-            </w:tcMar>
-            <w:vAlign w:val="center"/>
-          </w:tcPr>
-          <w:p>
-            <w:pPr>
-              <w:rPr>
-                <w:rFonts w:ascii="Times New Roman" w:hAnsi="Times New Roman" w:cs="Times New Roman"/>
-              </w:rPr>
-            </w:pPr>
-          </w:p>
-        </w:tc>
-        <w:tc>
-          <w:tcPr>
-            <w:tcW w:w="0" w:type="auto"/>
-            <w:tcMar>
-              <w:top w:w="80" w:type="dxa"/>
-              <w:left w:w="100" w:type="dxa"/>
-              <w:bottom w:w="80" w:type="dxa"/>
-              <w:right w:w="100" w:type="dxa"/>
-            </w:tcMar>
-            <w:vAlign w:val="center"/>
-          </w:tcPr>
-          <w:p>
-            <w:pPr>
-              <w:rPr>
-                <w:rFonts w:ascii="Times New Roman" w:hAnsi="Times New Roman" w:cs="Times New Roman"/>
-              </w:rPr>
-            </w:pPr>
+            <w:r>
+              <w:rPr>
+                <w:rFonts w:ascii="Times New Roman" w:hAnsi="Times New Roman" w:cs="Times New Roman"/>
+              </w:rPr>
+              <w:t xml:space="preserve">Sanskar and Damchey continued system design work in Figma (Login/Student Dashboard and Tutor Dashboard screens). Sanjuck drafted the Admin Dashboard feature list (summary cards, user management, reporting scope) ahead of the Figma design.</w:t>
+            </w:r>
+          </w:p>
+        </w:tc>
+        <w:tc>
+          <w:tcPr>
+            <w:tcW w:w="0" w:type="auto"/>
+            <w:tcMar>
+              <w:top w:w="80" w:type="dxa"/>
+              <w:left w:w="100" w:type="dxa"/>
+              <w:bottom w:w="80" w:type="dxa"/>
+              <w:right w:w="100" w:type="dxa"/>
+            </w:tcMar>
+            <w:vAlign w:val="center"/>
+          </w:tcPr>
+          <w:p>
+            <w:pPr>
+              <w:rPr>
+                <w:rFonts w:ascii="Times New Roman" w:hAnsi="Times New Roman" w:cs="Times New Roman"/>
+              </w:rPr>
+            </w:pPr>
+            <w:r>
+              <w:rPr>
+                <w:rFonts w:ascii="Times New Roman" w:hAnsi="Times New Roman" w:cs="Times New Roman"/>
+              </w:rPr>
+              <w:t>Continue Figma designs; begin GitHub repo setup (T208).</w:t>
+            </w:r>
+          </w:p>
+        </w:tc>
+        <w:tc>
+          <w:tcPr>
+            <w:tcW w:w="0" w:type="auto"/>
+            <w:tcMar>
+              <w:top w:w="80" w:type="dxa"/>
+              <w:left w:w="100" w:type="dxa"/>
+              <w:bottom w:w="80" w:type="dxa"/>
+              <w:right w:w="100" w:type="dxa"/>
+            </w:tcMar>
+            <w:vAlign w:val="center"/>
+          </w:tcPr>
+          <w:p>
+            <w:pPr>
+              <w:rPr>
+                <w:rFonts w:ascii="Times New Roman" w:hAnsi="Times New Roman" w:cs="Times New Roman"/>
+              </w:rPr>
+            </w:pPr>
+            <w:r>
+              <w:rPr>
+                <w:rFonts w:ascii="Times New Roman" w:hAnsi="Times New Roman" w:cs="Times New Roman"/>
+              </w:rPr>
+              <w:t>None</w:t>
+            </w:r>
           </w:p>
         </w:tc>
       </w:tr>
       <w:tr>
-        <w:tblPrEx>
-          <w:tblCellMar>
-            <w:top w:w="0" w:type="dxa"/>
-            <w:bottom w:w="0" w:type="dxa"/>
-          </w:tblCellMar>
-        </w:tblPrEx>
         <w:tc>
           <w:tcPr>
             <w:tcW w:w="0" w:type="auto"/>
@@ -4618,54 +4102,66 @@
                 <w:rFonts w:ascii="Times New Roman" w:hAnsi="Times New Roman" w:cs="Times New Roman"/>
               </w:rPr>
             </w:pPr>
-          </w:p>
-        </w:tc>
-        <w:tc>
-          <w:tcPr>
-            <w:tcW w:w="0" w:type="auto"/>
-            <w:tcMar>
-              <w:top w:w="80" w:type="dxa"/>
-              <w:left w:w="100" w:type="dxa"/>
-              <w:bottom w:w="80" w:type="dxa"/>
-              <w:right w:w="100" w:type="dxa"/>
-            </w:tcMar>
-            <w:vAlign w:val="center"/>
-          </w:tcPr>
-          <w:p>
-            <w:pPr>
-              <w:rPr>
-                <w:rFonts w:ascii="Times New Roman" w:hAnsi="Times New Roman" w:cs="Times New Roman"/>
-              </w:rPr>
-            </w:pPr>
-          </w:p>
-        </w:tc>
-        <w:tc>
-          <w:tcPr>
-            <w:tcW w:w="0" w:type="auto"/>
-            <w:tcMar>
-              <w:top w:w="80" w:type="dxa"/>
-              <w:left w:w="100" w:type="dxa"/>
-              <w:bottom w:w="80" w:type="dxa"/>
-              <w:right w:w="100" w:type="dxa"/>
-            </w:tcMar>
-            <w:vAlign w:val="center"/>
-          </w:tcPr>
-          <w:p>
-            <w:pPr>
-              <w:rPr>
-                <w:rFonts w:ascii="Times New Roman" w:hAnsi="Times New Roman" w:cs="Times New Roman"/>
-              </w:rPr>
-            </w:pPr>
+            <w:r>
+              <w:rPr>
+                <w:rFonts w:ascii="Times New Roman" w:hAnsi="Times New Roman" w:cs="Times New Roman"/>
+              </w:rPr>
+              <w:t>Set up GitHub repo (public), folder structure (frontend, backend, docs), and README with clone/run instructions. Configured branch protection on main (pull request plus 1 approval) and dev (pull request required), tested both confirmed working. Set dev as default branch. Added proposal and Sprint 1 report to docs. Invited all 4 teammates as collaborators.</w:t>
+            </w:r>
+          </w:p>
+        </w:tc>
+        <w:tc>
+          <w:tcPr>
+            <w:tcW w:w="0" w:type="auto"/>
+            <w:tcMar>
+              <w:top w:w="80" w:type="dxa"/>
+              <w:left w:w="100" w:type="dxa"/>
+              <w:bottom w:w="80" w:type="dxa"/>
+              <w:right w:w="100" w:type="dxa"/>
+            </w:tcMar>
+            <w:vAlign w:val="center"/>
+          </w:tcPr>
+          <w:p>
+            <w:pPr>
+              <w:rPr>
+                <w:rFonts w:ascii="Times New Roman" w:hAnsi="Times New Roman" w:cs="Times New Roman"/>
+              </w:rPr>
+            </w:pPr>
+            <w:r>
+              <w:rPr>
+                <w:rFonts w:ascii="Times New Roman" w:hAnsi="Times New Roman" w:cs="Times New Roman"/>
+              </w:rPr>
+              <w:t>Start T203: schedule and conduct interviews with Academic Affairs and ICT admin contacts.</w:t>
+            </w:r>
+          </w:p>
+        </w:tc>
+        <w:tc>
+          <w:tcPr>
+            <w:tcW w:w="0" w:type="auto"/>
+            <w:tcMar>
+              <w:top w:w="80" w:type="dxa"/>
+              <w:left w:w="100" w:type="dxa"/>
+              <w:bottom w:w="80" w:type="dxa"/>
+              <w:right w:w="100" w:type="dxa"/>
+            </w:tcMar>
+            <w:vAlign w:val="center"/>
+          </w:tcPr>
+          <w:p>
+            <w:pPr>
+              <w:rPr>
+                <w:rFonts w:ascii="Times New Roman" w:hAnsi="Times New Roman" w:cs="Times New Roman"/>
+              </w:rPr>
+            </w:pPr>
+            <w:r>
+              <w:rPr>
+                <w:rFonts w:ascii="Times New Roman" w:hAnsi="Times New Roman" w:cs="Times New Roman"/>
+              </w:rPr>
+              <w:t>None.</w:t>
+            </w:r>
           </w:p>
         </w:tc>
       </w:tr>
       <w:tr>
-        <w:tblPrEx>
-          <w:tblCellMar>
-            <w:top w:w="0" w:type="dxa"/>
-            <w:bottom w:w="0" w:type="dxa"/>
-          </w:tblCellMar>
-        </w:tblPrEx>
         <w:tc>
           <w:tcPr>
             <w:tcW w:w="0" w:type="auto"/>
@@ -4750,12 +4246,6 @@
         </w:tc>
       </w:tr>
       <w:tr>
-        <w:tblPrEx>
-          <w:tblCellMar>
-            <w:top w:w="0" w:type="dxa"/>
-            <w:bottom w:w="0" w:type="dxa"/>
-          </w:tblCellMar>
-        </w:tblPrEx>
         <w:tc>
           <w:tcPr>
             <w:tcW w:w="0" w:type="auto"/>
@@ -4840,12 +4330,6 @@
         </w:tc>
       </w:tr>
       <w:tr>
-        <w:tblPrEx>
-          <w:tblCellMar>
-            <w:top w:w="0" w:type="dxa"/>
-            <w:bottom w:w="0" w:type="dxa"/>
-          </w:tblCellMar>
-        </w:tblPrEx>
         <w:tc>
           <w:tcPr>
             <w:tcW w:w="0" w:type="auto"/>
@@ -4944,6 +4428,7 @@
           <w:rFonts w:ascii="Times New Roman" w:hAnsi="Times New Roman" w:cs="Times New Roman"/>
           <w:color w:val="auto"/>
         </w:rPr>
+        <w:lastRenderedPageBreak/>
         <w:t>4. Issues and Resolution</w:t>
       </w:r>
     </w:p>
@@ -5006,12 +4491,6 @@
         <w:gridCol w:w="1579"/>
       </w:tblGrid>
       <w:tr>
-        <w:tblPrEx>
-          <w:tblCellMar>
-            <w:top w:w="0" w:type="dxa"/>
-            <w:bottom w:w="0" w:type="dxa"/>
-          </w:tblCellMar>
-        </w:tblPrEx>
         <w:tc>
           <w:tcPr>
             <w:tcW w:w="0" w:type="auto"/>
@@ -5134,12 +4613,6 @@
         </w:tc>
       </w:tr>
       <w:tr>
-        <w:tblPrEx>
-          <w:tblCellMar>
-            <w:top w:w="0" w:type="dxa"/>
-            <w:bottom w:w="0" w:type="dxa"/>
-          </w:tblCellMar>
-        </w:tblPrEx>
         <w:tc>
           <w:tcPr>
             <w:tcW w:w="0" w:type="auto"/>
@@ -5269,12 +4742,6 @@
         <w:gridCol w:w="1522"/>
       </w:tblGrid>
       <w:tr>
-        <w:tblPrEx>
-          <w:tblCellMar>
-            <w:top w:w="0" w:type="dxa"/>
-            <w:bottom w:w="0" w:type="dxa"/>
-          </w:tblCellMar>
-        </w:tblPrEx>
         <w:tc>
           <w:tcPr>
             <w:tcW w:w="0" w:type="auto"/>
@@ -5397,12 +4864,6 @@
         </w:tc>
       </w:tr>
       <w:tr>
-        <w:tblPrEx>
-          <w:tblCellMar>
-            <w:top w:w="0" w:type="dxa"/>
-            <w:bottom w:w="0" w:type="dxa"/>
-          </w:tblCellMar>
-        </w:tblPrEx>
         <w:tc>
           <w:tcPr>
             <w:tcW w:w="0" w:type="auto"/>
@@ -5625,71 +5086,21 @@
         <w:rPr>
           <w:rFonts w:ascii="Times New Roman" w:hAnsi="Times New Roman" w:cs="Times New Roman"/>
         </w:rPr>
-        <w:t xml:space="preserve">• Planned Tasks: </w:t>
+        <w:t xml:space="preserve">• Planned Tasks: 9 core (T201–T208) + 1 stretch (T209)</w:t>
       </w:r>
+    </w:p>
+    <w:p>
+      <w:pPr>
+        <w:spacing w:after="80"/>
+        <w:rPr>
+          <w:rFonts w:ascii="Times New Roman" w:hAnsi="Times New Roman" w:cs="Times New Roman"/>
+        </w:rPr>
+      </w:pPr>
       <w:r>
         <w:rPr>
           <w:rFonts w:ascii="Times New Roman" w:hAnsi="Times New Roman" w:cs="Times New Roman"/>
         </w:rPr>
-        <w:t>9</w:t>
-      </w:r>
-      <w:r>
-        <w:rPr>
-          <w:rFonts w:ascii="Times New Roman" w:hAnsi="Times New Roman" w:cs="Times New Roman"/>
-        </w:rPr>
-        <w:t xml:space="preserve"> </w:t>
-      </w:r>
-      <w:proofErr w:type="gramStart"/>
-      <w:r>
-        <w:rPr>
-          <w:rFonts w:ascii="Times New Roman" w:hAnsi="Times New Roman" w:cs="Times New Roman"/>
-        </w:rPr>
-        <w:t>core</w:t>
-      </w:r>
-      <w:proofErr w:type="gramEnd"/>
-      <w:r>
-        <w:rPr>
-          <w:rFonts w:ascii="Times New Roman" w:hAnsi="Times New Roman" w:cs="Times New Roman"/>
-        </w:rPr>
-        <w:t xml:space="preserve"> (T201–T2</w:t>
-      </w:r>
-      <w:r>
-        <w:rPr>
-          <w:rFonts w:ascii="Times New Roman" w:hAnsi="Times New Roman" w:cs="Times New Roman"/>
-        </w:rPr>
-        <w:t>08</w:t>
-      </w:r>
-      <w:r>
-        <w:rPr>
-          <w:rFonts w:ascii="Times New Roman" w:hAnsi="Times New Roman" w:cs="Times New Roman"/>
-        </w:rPr>
-        <w:t>) + 1 stretch (T2</w:t>
-      </w:r>
-      <w:r>
-        <w:rPr>
-          <w:rFonts w:ascii="Times New Roman" w:hAnsi="Times New Roman" w:cs="Times New Roman"/>
-        </w:rPr>
-        <w:t>09</w:t>
-      </w:r>
-      <w:r>
-        <w:rPr>
-          <w:rFonts w:ascii="Times New Roman" w:hAnsi="Times New Roman" w:cs="Times New Roman"/>
-        </w:rPr>
-        <w:t>)</w:t>
-      </w:r>
-    </w:p>
-    <w:p>
-      <w:pPr>
-        <w:spacing w:after="80"/>
-        <w:rPr>
-          <w:rFonts w:ascii="Times New Roman" w:hAnsi="Times New Roman" w:cs="Times New Roman"/>
-        </w:rPr>
-      </w:pPr>
-      <w:r>
-        <w:rPr>
-          <w:rFonts w:ascii="Times New Roman" w:hAnsi="Times New Roman" w:cs="Times New Roman"/>
-        </w:rPr>
-        <w:t>• Completed Tasks: [fill in at week's end]</w:t>
+        <w:t>• Completed Tasks: 1 of 9 core tasks completed so far (T208)</w:t>
       </w:r>
     </w:p>
     <w:p>
@@ -5717,33 +5128,7 @@
         <w:rPr>
           <w:rFonts w:ascii="Times New Roman" w:hAnsi="Times New Roman" w:cs="Times New Roman"/>
         </w:rPr>
-        <w:t xml:space="preserve">• Sprint Velocity: [fill in — hours </w:t>
-      </w:r>
-      <w:proofErr w:type="gramStart"/>
-      <w:r>
-        <w:rPr>
-          <w:rFonts w:ascii="Times New Roman" w:hAnsi="Times New Roman" w:cs="Times New Roman"/>
-        </w:rPr>
-        <w:t>actually spent</w:t>
-      </w:r>
-      <w:proofErr w:type="gramEnd"/>
-      <w:r>
-        <w:rPr>
-          <w:rFonts w:ascii="Times New Roman" w:hAnsi="Times New Roman" w:cs="Times New Roman"/>
-        </w:rPr>
-        <w:t xml:space="preserve"> vs. the ~</w:t>
-      </w:r>
-      <w:r>
-        <w:rPr>
-          <w:rFonts w:ascii="Times New Roman" w:hAnsi="Times New Roman" w:cs="Times New Roman"/>
-        </w:rPr>
-        <w:t>54</w:t>
-      </w:r>
-      <w:r>
-        <w:rPr>
-          <w:rFonts w:ascii="Times New Roman" w:hAnsi="Times New Roman" w:cs="Times New Roman"/>
-        </w:rPr>
-        <w:t>hours planned]</w:t>
+        <w:t>• Sprint Velocity: [fill in — hours actually spent vs. the ~54hours planned]</w:t>
       </w:r>
     </w:p>
     <w:p>
@@ -5804,21 +5189,35 @@
         <w:rPr>
           <w:rFonts w:ascii="Times New Roman" w:hAnsi="Times New Roman" w:cs="Times New Roman"/>
         </w:rPr>
-        <w:t xml:space="preserve">Sprint 1 covers requirements and screen design only — the dev environment (frontend/backend scaffolding) and the Prisma schema haven't been built yet, so Sprint 2 </w:t>
+        <w:t>Sprint 1 covers requirements and screen design only — the dev environment (frontend/backend scaffolding) and the Prisma schema haven't been built yet, so Sprint 2 has to start there before any real feature code can be written.</w:t>
       </w:r>
-      <w:proofErr w:type="gramStart"/>
+    </w:p>
+    <w:p>
+      <w:pPr>
+        <w:spacing w:after="80"/>
+        <w:rPr>
+          <w:rFonts w:ascii="Times New Roman" w:hAnsi="Times New Roman" w:cs="Times New Roman"/>
+        </w:rPr>
+      </w:pPr>
       <w:r>
         <w:rPr>
           <w:rFonts w:ascii="Times New Roman" w:hAnsi="Times New Roman" w:cs="Times New Roman"/>
         </w:rPr>
-        <w:t>has to</w:t>
+        <w:t xml:space="preserve">• Epic: Development environment setup, followed by the start of authentication</w:t>
       </w:r>
-      <w:proofErr w:type="gramEnd"/>
+    </w:p>
+    <w:p>
+      <w:pPr>
+        <w:spacing w:after="80"/>
+        <w:rPr>
+          <w:rFonts w:ascii="Times New Roman" w:hAnsi="Times New Roman" w:cs="Times New Roman"/>
+        </w:rPr>
+      </w:pPr>
       <w:r>
         <w:rPr>
           <w:rFonts w:ascii="Times New Roman" w:hAnsi="Times New Roman" w:cs="Times New Roman"/>
         </w:rPr>
-        <w:t xml:space="preserve"> start there before any real feature code can be written.</w:t>
+        <w:t xml:space="preserve">• Major Tasks: Scaffold the Next.js frontend and Node.js/Express backend projects; draft the Prisma schema from the ERD in the proposal; begin building the login/signup flow from the Sprint 1 Figma design, informed by the validated requirements document.</w:t>
       </w:r>
     </w:p>
     <w:p>
@@ -5832,53 +5231,7 @@
         <w:rPr>
           <w:rFonts w:ascii="Times New Roman" w:hAnsi="Times New Roman" w:cs="Times New Roman"/>
         </w:rPr>
-        <w:t xml:space="preserve">• Epic: </w:t>
-      </w:r>
-      <w:r>
-        <w:rPr>
-          <w:rFonts w:ascii="Times New Roman" w:hAnsi="Times New Roman" w:cs="Times New Roman"/>
-        </w:rPr>
-        <w:t>Development environment setup, followed by the start of authentication</w:t>
-      </w:r>
-    </w:p>
-    <w:p>
-      <w:pPr>
-        <w:spacing w:after="80"/>
-        <w:rPr>
-          <w:rFonts w:ascii="Times New Roman" w:hAnsi="Times New Roman" w:cs="Times New Roman"/>
-        </w:rPr>
-      </w:pPr>
-      <w:r>
-        <w:rPr>
-          <w:rFonts w:ascii="Times New Roman" w:hAnsi="Times New Roman" w:cs="Times New Roman"/>
-        </w:rPr>
-        <w:t xml:space="preserve">• Major Tasks: </w:t>
-      </w:r>
-      <w:r>
-        <w:rPr>
-          <w:rFonts w:ascii="Times New Roman" w:hAnsi="Times New Roman" w:cs="Times New Roman"/>
-        </w:rPr>
-        <w:t>Scaffold the Next.js frontend and Node.js/Express backend projects; draft the Prisma schema from the ERD in the proposal; begin building the login/signup flow from the Sprint 1 Figma design, informed by the validated requirements document.</w:t>
-      </w:r>
-    </w:p>
-    <w:p>
-      <w:pPr>
-        <w:spacing w:after="80"/>
-        <w:rPr>
-          <w:rFonts w:ascii="Times New Roman" w:hAnsi="Times New Roman" w:cs="Times New Roman"/>
-        </w:rPr>
-      </w:pPr>
-      <w:r>
-        <w:rPr>
-          <w:rFonts w:ascii="Times New Roman" w:hAnsi="Times New Roman" w:cs="Times New Roman"/>
-        </w:rPr>
-        <w:t>• Anticipated Challenges: Getting the frontend and backend running consistently across everyone's machines; translating the ERD into a working Prisma schema without early data-modelling mistakes; folding in any changes the supervisor requests after reviewing the requirements document</w:t>
-      </w:r>
-      <w:r>
-        <w:rPr>
-          <w:rFonts w:ascii="Times New Roman" w:hAnsi="Times New Roman" w:cs="Times New Roman"/>
-        </w:rPr>
-        <w:t>.</w:t>
+        <w:t>• Anticipated Challenges: Getting the frontend and backend running consistently across everyone's machines; translating the ERD into a working Prisma schema without early data-modelling mistakes; folding in any changes the supervisor requests after reviewing the requirements document.</w:t>
       </w:r>
     </w:p>
     <w:p>
@@ -6070,111 +5423,35 @@
         <w:rPr>
           <w:rFonts w:ascii="Times New Roman" w:hAnsi="Times New Roman" w:cs="Times New Roman"/>
         </w:rPr>
-        <w:t xml:space="preserve">Team Lead: </w:t>
+        <w:t xml:space="preserve">Team Lead: Dechen Wangmo     Date: 07/09/2026</w:t>
       </w:r>
+    </w:p>
+    <w:p>
+      <w:pPr>
+        <w:spacing w:after="120"/>
+        <w:rPr>
+          <w:rFonts w:ascii="Times New Roman" w:hAnsi="Times New Roman" w:cs="Times New Roman"/>
+        </w:rPr>
+      </w:pPr>
       <w:r>
         <w:rPr>
           <w:rFonts w:ascii="Times New Roman" w:hAnsi="Times New Roman" w:cs="Times New Roman"/>
         </w:rPr>
-        <w:t>Dechen Wangmo</w:t>
+        <w:t xml:space="preserve">Guide: Mr. Parsu Ram Dhungyel     Date: 07/09/2026</w:t>
       </w:r>
+    </w:p>
+    <w:p>
+      <w:pPr>
+        <w:spacing w:after="120"/>
+        <w:rPr>
+          <w:rFonts w:ascii="Times New Roman" w:hAnsi="Times New Roman" w:cs="Times New Roman"/>
+        </w:rPr>
+      </w:pPr>
       <w:r>
         <w:rPr>
           <w:rFonts w:ascii="Times New Roman" w:hAnsi="Times New Roman" w:cs="Times New Roman"/>
         </w:rPr>
-        <w:t xml:space="preserve">     Date: </w:t>
-      </w:r>
-      <w:r>
-        <w:rPr>
-          <w:rFonts w:ascii="Times New Roman" w:hAnsi="Times New Roman" w:cs="Times New Roman"/>
-        </w:rPr>
-        <w:t>07/09/2026</w:t>
-      </w:r>
-    </w:p>
-    <w:p>
-      <w:pPr>
-        <w:spacing w:after="120"/>
-        <w:rPr>
-          <w:rFonts w:ascii="Times New Roman" w:hAnsi="Times New Roman" w:cs="Times New Roman"/>
-        </w:rPr>
-      </w:pPr>
-      <w:r>
-        <w:rPr>
-          <w:rFonts w:ascii="Times New Roman" w:hAnsi="Times New Roman" w:cs="Times New Roman"/>
-        </w:rPr>
-        <w:t xml:space="preserve">Guide: </w:t>
-      </w:r>
-      <w:r>
-        <w:rPr>
-          <w:rFonts w:ascii="Times New Roman" w:hAnsi="Times New Roman" w:cs="Times New Roman"/>
-        </w:rPr>
-        <w:t xml:space="preserve">Mr. </w:t>
-      </w:r>
-      <w:proofErr w:type="spellStart"/>
-      <w:r>
-        <w:rPr>
-          <w:rFonts w:ascii="Times New Roman" w:hAnsi="Times New Roman" w:cs="Times New Roman"/>
-        </w:rPr>
-        <w:t>Parsu</w:t>
-      </w:r>
-      <w:proofErr w:type="spellEnd"/>
-      <w:r>
-        <w:rPr>
-          <w:rFonts w:ascii="Times New Roman" w:hAnsi="Times New Roman" w:cs="Times New Roman"/>
-        </w:rPr>
-        <w:t xml:space="preserve"> Ram </w:t>
-      </w:r>
-      <w:proofErr w:type="spellStart"/>
-      <w:r>
-        <w:rPr>
-          <w:rFonts w:ascii="Times New Roman" w:hAnsi="Times New Roman" w:cs="Times New Roman"/>
-        </w:rPr>
-        <w:t>Dhungyel</w:t>
-      </w:r>
-      <w:proofErr w:type="spellEnd"/>
-      <w:r>
-        <w:rPr>
-          <w:rFonts w:ascii="Times New Roman" w:hAnsi="Times New Roman" w:cs="Times New Roman"/>
-        </w:rPr>
-        <w:t xml:space="preserve">     Date: </w:t>
-      </w:r>
-      <w:r>
-        <w:rPr>
-          <w:rFonts w:ascii="Times New Roman" w:hAnsi="Times New Roman" w:cs="Times New Roman"/>
-        </w:rPr>
-        <w:t>07/09/2026</w:t>
-      </w:r>
-    </w:p>
-    <w:p>
-      <w:pPr>
-        <w:spacing w:after="120"/>
-        <w:rPr>
-          <w:rFonts w:ascii="Times New Roman" w:hAnsi="Times New Roman" w:cs="Times New Roman"/>
-        </w:rPr>
-      </w:pPr>
-      <w:r>
-        <w:rPr>
-          <w:rFonts w:ascii="Times New Roman" w:hAnsi="Times New Roman" w:cs="Times New Roman"/>
-        </w:rPr>
-        <w:t xml:space="preserve">Co-Guide: </w:t>
-      </w:r>
-      <w:r>
-        <w:rPr>
-          <w:rFonts w:ascii="Times New Roman" w:hAnsi="Times New Roman" w:cs="Times New Roman"/>
-        </w:rPr>
-        <w:t xml:space="preserve">Mr. Pema Namgay </w:t>
-      </w:r>
-      <w:r>
-        <w:rPr>
-          <w:rFonts w:ascii="Times New Roman" w:hAnsi="Times New Roman" w:cs="Times New Roman"/>
-        </w:rPr>
-        <w:t xml:space="preserve">Date: </w:t>
-      </w:r>
-      <w:r>
-        <w:rPr>
-          <w:rFonts w:ascii="Times New Roman" w:hAnsi="Times New Roman" w:cs="Times New Roman"/>
-        </w:rPr>
-        <w:t>07/09/2026</w:t>
+        <w:t xml:space="preserve">Co-Guide: Mr. Pema Namgay Date: 07/09/2026</w:t>
       </w:r>
     </w:p>
     <w:p>
@@ -6205,7 +5482,7 @@
 </file>
 
 <file path=word/numbering.xml><?xml version="1.0" encoding="utf-8"?>
-<w:numbering xmlns:wpc="http://schemas.microsoft.com/office/word/2010/wordprocessingCanvas" xmlns:cx="http://schemas.microsoft.com/office/drawing/2014/chartex" xmlns:cx1="http://schemas.microsoft.com/office/drawing/2015/9/8/chartex" xmlns:cx2="http://schemas.microsoft.com/office/drawing/2015/10/21/chartex" xmlns:cx3="http://schemas.microsoft.com/office/drawing/2016/5/9/chartex" xmlns:cx4="http://schemas.microsoft.com/office/drawing/2016/5/10/chartex" xmlns:cx5="http://schemas.microsoft.com/office/drawing/2016/5/11/chartex" xmlns:cx6="http://schemas.microsoft.com/office/drawing/2016/5/12/chartex" xmlns:cx7="http://schemas.microsoft.com/office/drawing/2016/5/13/chartex" xmlns:cx8="http://schemas.microsoft.com/office/drawing/2016/5/14/chartex" xmlns:mc="http://schemas.openxmlformats.org/markup-compatibility/2006" xmlns:aink="http://schemas.microsoft.com/office/drawing/2016/ink" xmlns:am3d="http://schemas.microsoft.com/office/drawing/2017/model3d" xmlns:o="urn:schemas-microsoft-com:office:office" xmlns:oel="http://schemas.microsoft.com/office/2019/extlst" xmlns:r="http://schemas.openxmlformats.org/officeDocument/2006/relationships" xmlns:m="http://schemas.openxmlformats.org/officeDocument/2006/math" xmlns:v="urn:schemas-microsoft-com:vml" xmlns:wp14="http://schemas.microsoft.com/office/word/2010/wordprocessingDrawing" xmlns:wp="http://schemas.openxmlformats.org/drawingml/2006/wordprocessingDrawing" xmlns:w10="urn:schemas-microsoft-com:office:word" xmlns:w="http://schemas.openxmlformats.org/wordprocessingml/2006/main" xmlns:w14="http://schemas.microsoft.com/office/word/2010/wordml" xmlns:w15="http://schemas.microsoft.com/office/word/2012/wordml" xmlns:w16cex="http://schemas.microsoft.com/office/word/2018/wordml/cex" xmlns:w16cid="http://schemas.microsoft.com/office/word/2016/wordml/cid" xmlns:w16="http://schemas.microsoft.com/office/word/2018/wordml" xmlns:w16du="http://schemas.microsoft.com/office/word/2023/wordml/word16du" xmlns:w16sdtdh="http://schemas.microsoft.com/office/word/2020/wordml/sdtdatahash" xmlns:w16sdtfl="http://schemas.microsoft.com/office/word/2024/wordml/sdtformatlock" xmlns:w16se="http://schemas.microsoft.com/office/word/2015/wordml/symex" xmlns:wpg="http://schemas.microsoft.com/office/word/2010/wordprocessingGroup" xmlns:wpi="http://schemas.microsoft.com/office/word/2010/wordprocessingInk" xmlns:wne="http://schemas.microsoft.com/office/word/2006/wordml" xmlns:wps="http://schemas.microsoft.com/office/word/2010/wordprocessingShape" mc:Ignorable="w14 w15 w16se w16cid w16 w16cex w16sdtdh w16sdtfl w16du wp14">
+<w:numbering xmlns:wpc="http://schemas.microsoft.com/office/word/2010/wordprocessingCanvas" xmlns:cx="http://schemas.microsoft.com/office/drawing/2014/chartex" xmlns:cx1="http://schemas.microsoft.com/office/drawing/2015/9/8/chartex" xmlns:cx2="http://schemas.microsoft.com/office/drawing/2015/10/21/chartex" xmlns:cx3="http://schemas.microsoft.com/office/drawing/2016/5/9/chartex" xmlns:cx4="http://schemas.microsoft.com/office/drawing/2016/5/10/chartex" xmlns:cx5="http://schemas.microsoft.com/office/drawing/2016/5/11/chartex" xmlns:cx6="http://schemas.microsoft.com/office/drawing/2016/5/12/chartex" xmlns:cx7="http://schemas.microsoft.com/office/drawing/2016/5/13/chartex" xmlns:cx8="http://schemas.microsoft.com/office/drawing/2016/5/14/chartex" xmlns:mc="http://schemas.openxmlformats.org/markup-compatibility/2006" xmlns:aink="http://schemas.microsoft.com/office/drawing/2016/ink" xmlns:am3d="http://schemas.microsoft.com/office/drawing/2017/model3d" xmlns:o="urn:schemas-microsoft-com:office:office" xmlns:oel="http://schemas.microsoft.com/office/2019/extlst" xmlns:r="http://schemas.openxmlformats.org/officeDocument/2006/relationships" xmlns:m="http://schemas.openxmlformats.org/officeDocument/2006/math" xmlns:v="urn:schemas-microsoft-com:vml" xmlns:wp14="http://schemas.microsoft.com/office/word/2010/wordprocessingDrawing" xmlns:wp="http://schemas.openxmlformats.org/drawingml/2006/wordprocessingDrawing" xmlns:w10="urn:schemas-microsoft-com:office:word" xmlns:w="http://schemas.openxmlformats.org/wordprocessingml/2006/main" xmlns:w14="http://schemas.microsoft.com/office/word/2010/wordml" xmlns:w15="http://schemas.microsoft.com/office/word/2012/wordml" xmlns:w16cex="http://schemas.microsoft.com/office/word/2018/wordml/cex" xmlns:w16cid="http://schemas.microsoft.com/office/word/2016/wordml/cid" xmlns:w16="http://schemas.microsoft.com/office/word/2018/wordml" xmlns:w16sdtdh="http://schemas.microsoft.com/office/word/2020/wordml/sdtdatahash" xmlns:w16se="http://schemas.microsoft.com/office/word/2015/wordml/symex" xmlns:wpg="http://schemas.microsoft.com/office/word/2010/wordprocessingGroup" xmlns:wpi="http://schemas.microsoft.com/office/word/2010/wordprocessingInk" xmlns:wne="http://schemas.microsoft.com/office/word/2006/wordml" xmlns:wps="http://schemas.microsoft.com/office/word/2010/wordprocessingShape" mc:Ignorable="w14 w15 w16se w16cid w16 w16cex w16sdtdh wp14">
   <w:abstractNum w:abstractNumId="0" w15:restartNumberingAfterBreak="0">
     <w:nsid w:val="47B11E26"/>
     <w:multiLevelType w:val="hybridMultilevel"/>
@@ -6326,7 +5603,7 @@
 </file>
 
 <file path=word/styles.xml><?xml version="1.0" encoding="utf-8"?>
-<w:styles xmlns:mc="http://schemas.openxmlformats.org/markup-compatibility/2006" xmlns:r="http://schemas.openxmlformats.org/officeDocument/2006/relationships" xmlns:w="http://schemas.openxmlformats.org/wordprocessingml/2006/main" xmlns:w14="http://schemas.microsoft.com/office/word/2010/wordml" xmlns:w15="http://schemas.microsoft.com/office/word/2012/wordml" xmlns:w16cex="http://schemas.microsoft.com/office/word/2018/wordml/cex" xmlns:w16cid="http://schemas.microsoft.com/office/word/2016/wordml/cid" xmlns:w16="http://schemas.microsoft.com/office/word/2018/wordml" xmlns:w16du="http://schemas.microsoft.com/office/word/2023/wordml/word16du" xmlns:w16sdtdh="http://schemas.microsoft.com/office/word/2020/wordml/sdtdatahash" xmlns:w16sdtfl="http://schemas.microsoft.com/office/word/2024/wordml/sdtformatlock" xmlns:w16se="http://schemas.microsoft.com/office/word/2015/wordml/symex" mc:Ignorable="w14 w15 w16se w16cid w16 w16cex w16sdtdh w16sdtfl w16du">
+<w:styles xmlns:mc="http://schemas.openxmlformats.org/markup-compatibility/2006" xmlns:r="http://schemas.openxmlformats.org/officeDocument/2006/relationships" xmlns:w="http://schemas.openxmlformats.org/wordprocessingml/2006/main" xmlns:w14="http://schemas.microsoft.com/office/word/2010/wordml" xmlns:w15="http://schemas.microsoft.com/office/word/2012/wordml" xmlns:w16cex="http://schemas.microsoft.com/office/word/2018/wordml/cex" xmlns:w16cid="http://schemas.microsoft.com/office/word/2016/wordml/cid" xmlns:w16="http://schemas.microsoft.com/office/word/2018/wordml" xmlns:w16sdtdh="http://schemas.microsoft.com/office/word/2020/wordml/sdtdatahash" xmlns:w16se="http://schemas.microsoft.com/office/word/2015/wordml/symex" mc:Ignorable="w14 w15 w16se w16cid w16 w16cex w16sdtdh">
   <w:docDefaults>
     <w:rPrDefault>
       <w:rPr>
@@ -6929,6 +6206,7 @@
   <w:style w:type="character" w:default="1" w:styleId="DefaultParagraphFont">
     <w:name w:val="Default Paragraph Font"/>
     <w:uiPriority w:val="1"/>
+    <w:semiHidden/>
     <w:unhideWhenUsed/>
   </w:style>
   <w:style w:type="table" w:default="1" w:styleId="TableNormal">

</xml_diff>